<commit_message>
Remuneration Policy: reintroduce consistent section numbering
Number the previously-unnumbered headings (1 Introduction, 2 Objectives, 3
Board remuneration with 3.1-3.4, 4 Executive Management with 4.1 Fixed pay /
4.2 Pension and benefits) so numbering is consistent throughout — matching the
existing 4.2.1/4.3.x sub-provisions. (Missing-pages item still needs the full
source from the requester; current source renders completely.)

Co-Authored-By: Claude Opus 4.8 <noreply@anthropic.com>
Claude-Session: https://claude.ai/code/session_01W3gw8scX9B7oMC33JPxjbS
</commit_message>
<xml_diff>
--- a/docs/files/Remuneration_Policy__Policy_2026-06.docx
+++ b/docs/files/Remuneration_Policy__Policy_2026-06.docx
@@ -19,7 +19,7 @@
               <a:graphicData uri="http://schemas.openxmlformats.org/drawingml/2006/picture">
                 <pic:pic>
                   <pic:nvPicPr>
-                    <pic:cNvPr id="0" name="tmpphosuvzg.png"/>
+                    <pic:cNvPr id="0" name="tmp6z6u_rps.png"/>
                     <pic:cNvPicPr/>
                   </pic:nvPicPr>
                   <pic:blipFill>
@@ -64,7 +64,7 @@
           <w:color w:val="1C4076"/>
           <w:sz w:val="28"/>
         </w:rPr>
-        <w:t>Introduction</w:t>
+        <w:t>1 Introduction</w:t>
       </w:r>
     </w:p>
     <w:p>
@@ -109,7 +109,7 @@
           <w:color w:val="1C4076"/>
           <w:sz w:val="24"/>
         </w:rPr>
-        <w:t>Objectives</w:t>
+        <w:t>2 Objectives</w:t>
       </w:r>
     </w:p>
     <w:p>
@@ -154,7 +154,7 @@
           <w:color w:val="1C4076"/>
           <w:sz w:val="24"/>
         </w:rPr>
-        <w:t>Remuneration of the members of the Board of Directors</w:t>
+        <w:t>3 Remuneration of the members of the Board of Directors</w:t>
       </w:r>
     </w:p>
     <w:p>
@@ -563,7 +563,7 @@
           <w:color w:val="1C4076"/>
           <w:sz w:val="22"/>
         </w:rPr>
-        <w:t>Incentive pay</w:t>
+        <w:t>3.1 Incentive pay</w:t>
       </w:r>
     </w:p>
     <w:p>
@@ -593,7 +593,7 @@
           <w:color w:val="1C4076"/>
           <w:sz w:val="22"/>
         </w:rPr>
-        <w:t>Ad-hoc tasks</w:t>
+        <w:t>3.2 Ad-hoc tasks</w:t>
       </w:r>
     </w:p>
     <w:p>
@@ -623,7 +623,7 @@
           <w:color w:val="1C4076"/>
           <w:sz w:val="22"/>
         </w:rPr>
-        <w:t>Benefits and reimbursement of expenses</w:t>
+        <w:t>3.3 Benefits and reimbursement of expenses</w:t>
       </w:r>
     </w:p>
     <w:p>
@@ -668,7 +668,7 @@
           <w:color w:val="1C4076"/>
           <w:sz w:val="22"/>
         </w:rPr>
-        <w:t>Term</w:t>
+        <w:t>3.4 Term</w:t>
       </w:r>
     </w:p>
     <w:p>
@@ -698,7 +698,7 @@
           <w:color w:val="1C4076"/>
           <w:sz w:val="24"/>
         </w:rPr>
-        <w:t>Remuneration of Executive Management</w:t>
+        <w:t>4 Remuneration of Executive Management</w:t>
       </w:r>
     </w:p>
     <w:p>
@@ -728,7 +728,7 @@
           <w:color w:val="1C4076"/>
           <w:sz w:val="22"/>
         </w:rPr>
-        <w:t>Fixed pay</w:t>
+        <w:t>4.1 Fixed pay</w:t>
       </w:r>
     </w:p>
     <w:p>
@@ -758,7 +758,7 @@
           <w:color w:val="1C4076"/>
           <w:sz w:val="22"/>
         </w:rPr>
-        <w:t>Pension and benefits</w:t>
+        <w:t>4.2 Pension and benefits</w:t>
       </w:r>
     </w:p>
     <w:p>

</xml_diff>

<commit_message>
Remuneration Policy: reinstate the full document (missing sections)
Replaced the source with the complete official version: our source was
truncated at 4.3.6, missing 4.3.7 Extraordinary incentives, 4.3.8 Clawback and
sections 5-11 (Service agreements, D&O insurance & indemnification, Deviations,
Remuneration to other employees, Approval process & conflicts of interest,
Remuneration report, Adoption and publication). The full version already
carries consistent numbering throughout (1.1 … 11.1). Renders at 11 pages;
approver General Meeting, adopted 13-05-2026. Owner still to be confirmed.

Co-Authored-By: Claude Opus 4.8 <noreply@anthropic.com>
Claude-Session: https://claude.ai/code/session_01W3gw8scX9B7oMC33JPxjbS
</commit_message>
<xml_diff>
--- a/docs/files/Remuneration_Policy__Policy_2026-06.docx
+++ b/docs/files/Remuneration_Policy__Policy_2026-06.docx
@@ -19,7 +19,7 @@
               <a:graphicData uri="http://schemas.openxmlformats.org/drawingml/2006/picture">
                 <pic:pic>
                   <pic:nvPicPr>
-                    <pic:cNvPr id="0" name="tmp6z6u_rps.png"/>
+                    <pic:cNvPr id="0" name="tmpr7z8jy9o.png"/>
                     <pic:cNvPicPr/>
                   </pic:nvPicPr>
                   <pic:blipFill>
@@ -64,7 +64,7 @@
           <w:color w:val="1C4076"/>
           <w:sz w:val="28"/>
         </w:rPr>
-        <w:t>1 Introduction</w:t>
+        <w:t>Introduction</w:t>
       </w:r>
     </w:p>
     <w:p>
@@ -79,7 +79,7 @@
           <w:color w:val="1C4076"/>
           <w:sz w:val="22"/>
         </w:rPr>
-        <w:t>This remuneration policy (the “Remuneration Policy”) of BioMar Group A/S, CVR no. 38 57 06 17 (the “Company”) has been prepared in accordance with section 139 and 139a of the Danish Companies Act and the recommendations published by the Danish Committee on Corporate Governance as implemented by Nasdaq Copenhagen A/S.</w:t>
+        <w:t>1.1 This remuneration policy (the “Remuneration Policy”) of BioMar Group A/S, CVR no. 38 57 06 17 (the “Company”) has been prepared in accordance with section 139 and 139a of the Danish Companies Act and the recommendations published by the Danish Committee on Corporate Governance as implemented by Nasdaq Copenhagen A/S.</w:t>
       </w:r>
     </w:p>
     <w:p>
@@ -94,22 +94,22 @@
           <w:color w:val="1C4076"/>
           <w:sz w:val="22"/>
         </w:rPr>
-        <w:t>The Remuneration Policy sets out the framework for remuneration to the Board of Directors and the Executive Management of the Company. The “Executive Management” consists of the members of the executive management of the Company registered as such with the Danish Business Authority. “Group” refers to BioMar Group A/S as well as its subsidiaries.</w:t>
+        <w:t>1.2 The Remuneration Policy sets out the framework for remuneration to the Board of Directors and the Executive Management of the Company. The “Executive Management” consists of the members of the executive management of the Company registered as such with the Danish Business Authority. “Group” refers to BioMar Group A/S as well as its subsidiaries.</w:t>
       </w:r>
     </w:p>
     <w:p>
       <w:pPr>
         <w:keepNext/>
-        <w:spacing w:before="120" w:after="80"/>
+        <w:spacing w:before="260" w:after="160"/>
       </w:pPr>
       <w:r>
         <w:rPr>
           <w:rFonts w:ascii="Avenir Next LT Pro" w:hAnsi="Avenir Next LT Pro"/>
           <w:b/>
           <w:color w:val="1C4076"/>
-          <w:sz w:val="24"/>
+          <w:sz w:val="28"/>
         </w:rPr>
-        <w:t>2 Objectives</w:t>
+        <w:t>Objectives</w:t>
       </w:r>
     </w:p>
     <w:p>
@@ -124,7 +124,7 @@
           <w:color w:val="1C4076"/>
           <w:sz w:val="22"/>
         </w:rPr>
-        <w:t>The overall objectives of this Remuneration Policy are (i) to attract, motivate and retain qualified members of the Board of Directors and Executive Management, (ii) to ensure alignment of interests between the Board of Directors, Executive Management, the Company itself and its shareholders, and (iii) to ensure and maintain the motivation for achieving the Group’s strategic short and long-term targets as well as to promote long-term sustainable value creation for the benefit of the shareholders.</w:t>
+        <w:t>2.1 The overall objectives of this Remuneration Policy are (i) to attract, motivate and retain qualified members of the Board of Directors and Executive Management, (ii) to ensure alignment of interests between the Board of Directors, Executive Management, the Company itself and its shareholders, and (iii) to ensure and maintain the motivation for achieving the Group’s strategic short and long-term targets as well as to promote long-term sustainable value creation for the benefit of the shareholders.</w:t>
       </w:r>
     </w:p>
     <w:p>
@@ -139,22 +139,22 @@
           <w:color w:val="1C4076"/>
           <w:sz w:val="22"/>
         </w:rPr>
-        <w:t>The Board of Directors considers that the composition of remuneration supports these objectives. The actual remuneration paid to the Board of Directors and Executive Management in a financial year is decided by the Board of Directors based on recommendations from the Remuneration and Nomination Committee. The Board of Directors shall ensure that the remuneration is in compliance with this Remuneration Policy and that the remuneration does not exceed what is considered usual taking into account the nature and extent of the work and the Company’s financial position.</w:t>
+        <w:t>2.2 The Board of Directors considers that the composition of remuneration supports these objectives. The actual remuneration paid to the Board of Directors and Executive Management in a financial year is decided by the Board of Directors based on recommendations from the Remuneration and Nomination Committee. The Board of Directors shall ensure that the remuneration is in compliance with this Remuneration Policy and that the remuneration does not exceed what is considered usual taking into account the nature and extent of the work and the Company’s financial position.</w:t>
       </w:r>
     </w:p>
     <w:p>
       <w:pPr>
         <w:keepNext/>
-        <w:spacing w:before="120" w:after="80"/>
+        <w:spacing w:before="260" w:after="160"/>
       </w:pPr>
       <w:r>
         <w:rPr>
           <w:rFonts w:ascii="Avenir Next LT Pro" w:hAnsi="Avenir Next LT Pro"/>
           <w:b/>
           <w:color w:val="1C4076"/>
-          <w:sz w:val="24"/>
+          <w:sz w:val="28"/>
         </w:rPr>
-        <w:t>3 Remuneration of the members of the Board of Directors</w:t>
+        <w:t>Remuneration of the members of the Board of Directors</w:t>
       </w:r>
     </w:p>
     <w:p>
@@ -170,6 +170,21 @@
           <w:sz w:val="22"/>
         </w:rPr>
         <w:t>The remuneration offered to the members of the Board of Directors shall be designed to be able to attract and retain competent members to the Board of Directors taking into consideration the market practice of comparable listed companies as well as due regard to the required competencies, experience, knowledge, effort and scope of work of the members of the Board of Directors.</w:t>
+      </w:r>
+    </w:p>
+    <w:p>
+      <w:pPr>
+        <w:spacing w:after="200"/>
+        <w:jc w:val="both"/>
+      </w:pPr>
+      <w:r>
+        <w:rPr>
+          <w:rFonts w:ascii="Avenir Next LT Pro" w:hAnsi="Avenir Next LT Pro"/>
+          <w:b w:val="0"/>
+          <w:color w:val="1C4076"/>
+          <w:sz w:val="22"/>
+        </w:rPr>
+        <w:t>3.1 Fixed fee</w:t>
       </w:r>
     </w:p>
     <w:p>
@@ -215,7 +230,7 @@
                 <w:color w:val="FFFFFF"/>
                 <w:sz w:val="17"/>
               </w:rPr>
-              <w:t>Table 1: Remuneration structure of the Board of Directors – fxi ed fee multiples</w:t>
+              <w:t>Table 1: Remuneration structure of the Board of Directors – fixed fee multiples</w:t>
             </w:r>
           </w:p>
         </w:tc>
@@ -233,6 +248,7 @@
                 <w:color w:val="FFFFFF"/>
                 <w:sz w:val="17"/>
               </w:rPr>
+              <w:t>Table 1: Remuneration structure of the Board of Directors – fixed fee multiples</w:t>
             </w:r>
           </w:p>
         </w:tc>
@@ -250,6 +266,7 @@
                 <w:color w:val="FFFFFF"/>
                 <w:sz w:val="17"/>
               </w:rPr>
+              <w:t>Table 1: Remuneration structure of the Board of Directors – fixed fee multiples</w:t>
             </w:r>
           </w:p>
         </w:tc>
@@ -267,6 +284,7 @@
                 <w:color w:val="FFFFFF"/>
                 <w:sz w:val="17"/>
               </w:rPr>
+              <w:t>Table 1: Remuneration structure of the Board of Directors – fixed fee multiples</w:t>
             </w:r>
           </w:p>
         </w:tc>
@@ -559,11 +577,11 @@
       <w:r>
         <w:rPr>
           <w:rFonts w:ascii="Avenir Next LT Pro" w:hAnsi="Avenir Next LT Pro"/>
-          <w:b/>
+          <w:b w:val="0"/>
           <w:color w:val="1C4076"/>
           <w:sz w:val="22"/>
         </w:rPr>
-        <w:t>3.1 Incentive pay</w:t>
+        <w:t>3.2 Incentive pay</w:t>
       </w:r>
     </w:p>
     <w:p>
@@ -589,11 +607,11 @@
       <w:r>
         <w:rPr>
           <w:rFonts w:ascii="Avenir Next LT Pro" w:hAnsi="Avenir Next LT Pro"/>
-          <w:b/>
+          <w:b w:val="0"/>
           <w:color w:val="1C4076"/>
           <w:sz w:val="22"/>
         </w:rPr>
-        <w:t>3.2 Ad-hoc tasks</w:t>
+        <w:t>3.3 Ad-hoc tasks</w:t>
       </w:r>
     </w:p>
     <w:p>
@@ -619,11 +637,11 @@
       <w:r>
         <w:rPr>
           <w:rFonts w:ascii="Avenir Next LT Pro" w:hAnsi="Avenir Next LT Pro"/>
-          <w:b/>
+          <w:b w:val="0"/>
           <w:color w:val="1C4076"/>
           <w:sz w:val="22"/>
         </w:rPr>
-        <w:t>3.3 Benefits and reimbursement of expenses</w:t>
+        <w:t>3.4 Benefits and reimbursement of expenses</w:t>
       </w:r>
     </w:p>
     <w:p>
@@ -664,11 +682,11 @@
       <w:r>
         <w:rPr>
           <w:rFonts w:ascii="Avenir Next LT Pro" w:hAnsi="Avenir Next LT Pro"/>
-          <w:b/>
+          <w:b w:val="0"/>
           <w:color w:val="1C4076"/>
           <w:sz w:val="22"/>
         </w:rPr>
-        <w:t>3.4 Term</w:t>
+        <w:t>3.5 Term</w:t>
       </w:r>
     </w:p>
     <w:p>
@@ -689,16 +707,16 @@
     <w:p>
       <w:pPr>
         <w:keepNext/>
-        <w:spacing w:before="120" w:after="80"/>
+        <w:spacing w:before="260" w:after="160"/>
       </w:pPr>
       <w:r>
         <w:rPr>
           <w:rFonts w:ascii="Avenir Next LT Pro" w:hAnsi="Avenir Next LT Pro"/>
           <w:b/>
           <w:color w:val="1C4076"/>
-          <w:sz w:val="24"/>
+          <w:sz w:val="28"/>
         </w:rPr>
-        <w:t>4 Remuneration of Executive Management</w:t>
+        <w:t>Remuneration of Executive Management</w:t>
       </w:r>
     </w:p>
     <w:p>
@@ -724,7 +742,7 @@
       <w:r>
         <w:rPr>
           <w:rFonts w:ascii="Avenir Next LT Pro" w:hAnsi="Avenir Next LT Pro"/>
-          <w:b/>
+          <w:b w:val="0"/>
           <w:color w:val="1C4076"/>
           <w:sz w:val="22"/>
         </w:rPr>
@@ -893,7 +911,16 @@
           <w:color w:val="1C4076"/>
           <w:sz w:val="22"/>
         </w:rPr>
-        <w:t>4.3.4 Short-term incentives</w:t>
+        <w:t>4.3.4</w:t>
+      </w:r>
+      <w:r>
+        <w:rPr>
+          <w:rFonts w:ascii="Avenir Next LT Pro" w:hAnsi="Avenir Next LT Pro"/>
+          <w:b/>
+          <w:color w:val="1C4076"/>
+          <w:sz w:val="22"/>
+        </w:rPr>
+        <w:t>Short-term incentives</w:t>
       </w:r>
     </w:p>
     <w:p>
@@ -908,7 +935,7 @@
           <w:color w:val="1C4076"/>
           <w:sz w:val="22"/>
         </w:rPr>
-        <w:t>4.3.4.1 The short-term incentive consists of a cash-based bonus designed to incentivise and encourage the members of Executive Management to perform in alignment with the Group’s short-term objectives.</w:t>
+        <w:t>4.3.4.1 The short-term incentive consists of a cash-based bonus designed to incentivise and encourage the members of Executive Management to perform in alignment with the Group's short-term objectives.</w:t>
       </w:r>
     </w:p>
     <w:p>
@@ -923,7 +950,7 @@
           <w:color w:val="1C4076"/>
           <w:sz w:val="22"/>
         </w:rPr>
-        <w:t>4.3.4.2 The annual cash bonus is dependent on the achievement of specific targets and metrics as approved by the Board of Directors each year. Performance shall be measured for each financial year and will depend on the achievement of certain criteria such as financial KPIs, that may include EBIT, EBITDA, return on invested capital, total shareholder return, sales volumes and net working capital, and non- financial KPIs, that may include ESG/sustainability related objectives as well as individual performance targets. The specific criteria as well as the weight of each criteria may vary from year to year as determined by the Board of Directors.</w:t>
+        <w:t>4.3.4.2 The annual cash bonus is dependent on the achievement of specific targets and metrics as approved by the Board of Directors each year. Performance shall be measured for each financial year and will depend on the achievement of certain criteria such as financial KPIs, that may include EBIT, EBITDA, return on invested capital, total shareholder return, sales volumes and net working capital, and non-financial KPIs, that may include ESG/sustainability related objectives as well as individual performance targets. The specific criteria as well as the weight of each criteria may vary from year to year as determined by the Board of Directors.</w:t>
       </w:r>
     </w:p>
     <w:p>
@@ -983,7 +1010,16 @@
           <w:color w:val="1C4076"/>
           <w:sz w:val="22"/>
         </w:rPr>
-        <w:t>4.3.5 Long-term incentives</w:t>
+        <w:t>4.3.5</w:t>
+      </w:r>
+      <w:r>
+        <w:rPr>
+          <w:rFonts w:ascii="Avenir Next LT Pro" w:hAnsi="Avenir Next LT Pro"/>
+          <w:b/>
+          <w:color w:val="1C4076"/>
+          <w:sz w:val="22"/>
+        </w:rPr>
+        <w:t>Long-term incentives</w:t>
       </w:r>
     </w:p>
     <w:p>
@@ -1133,7 +1169,7 @@
           <w:color w:val="1C4076"/>
           <w:sz w:val="22"/>
         </w:rPr>
-        <w:t>(a) Members of Executive Management may be eligible to receive long-term incentives in the form of RSUs or PSUs. The programmes are designed to further align management compensation with the long- term interests of the shareholders and the performance of the Company by linking a higher proportion of annual pay to the share price development of the Company as well as certain performance targets with respect to PSUs. Further, the programmes support the Company’s long term business model and strategy.</w:t>
+        <w:t>(a) Members of Executive Management may be eligible to receive long-term incentives in the form of RSUs or PSUs. The programmes are designed to further align management compensation with the long-term interests of the shareholders and the performance of the Company by linking a higher proportion of annual pay to the share price development of the Company as well as certain performance targets with respect to PSUs. Further, the programmes support the Company’s long term business model and strategy.</w:t>
       </w:r>
     </w:p>
     <w:p>
@@ -1163,7 +1199,7 @@
           <w:color w:val="1C4076"/>
           <w:sz w:val="22"/>
         </w:rPr>
-        <w:t>(c) Grant of RSUs does not depend on the achievement of specific goals whereas grant of PSUs shall be subject to achievement of specific goals, that may include with main weight on core financial KPIs such as ROIC, EBITDA/EBIT, Sales Volumes, total shareholder return and net working capital. In addition, non-financial KPIs could be considered to a limited degree, such as ESG/sustainability related objectives as well as individual performance targets as financial targets such as EBIT, EBITDA, return on invested capital, total shareholder return, sales volumes and net working capital, and/or other non-financial targets or objectives such as ESG/sustainability related objectives as determined by the Board of Directors from time to time. Ownership of shares is transferred free of charge or by payment of par value of the shares delivered to each member of Executive Management three years after the time of grant (the “Vesting Period”), contingent on achievement of the pre-established KPIs, if any, and the member of Executive Management not having resigned during the Vesting Period. During the Vesting Period, no transfer of shares to the individual member of Executive Management will take place. After expiry of the Vesting Period and transfer of ownership of shares to the individual member of Executive Management, the member shall have all rights and obligations as shareholder of the Company, including the entitlement to receive dividends.</w:t>
+        <w:t>(c) Grant of RSUs does not depend on the achievement of specific goals whereas grant of PSUs shall be subject to achievement of specific goals, that may include with main weight on core financial KPIs such as ROIC, EBITDA/EBIT, Sales Volumes, total shareholder return and net working capital. In addition, non-financial KPIs could be considered to a limited degree, such as ESG/sustainability related objectives as well as individual performance targets as financial targets such as EBIT, EBITDA, return on invested capital, total shareholder return, sales volumes  and net working capital, and/or other non-financial targets or objectives such as ESG/sustainability related objectives as determined by the Board of Directors from time to time. Ownership of shares is transferred free of charge or by payment of par value of the shares delivered to each member of Executive Management three years after the time of grant (the “Vesting Period”), contingent on achievement of the pre-established KPIs, if any, and the member of Executive Management not having resigned during the Vesting Period. During the Vesting Period, no transfer of shares to the individual member of Executive Management will take place. After expiry of the Vesting Period and transfer of ownership of shares to the individual member of Executive Management, the member shall have all rights and obligations as shareholder of the Company, including the entitlement to receive dividends.</w:t>
       </w:r>
     </w:p>
     <w:p>
@@ -1178,7 +1214,7 @@
           <w:color w:val="1C4076"/>
           <w:sz w:val="22"/>
         </w:rPr>
-        <w:t>(d) The Company intends to use treasury shares to meet its obligations in relation to long-term share- based incentives. The Board of Directors may decide to satisfy a grant in cash if deemed appropriate.</w:t>
+        <w:t>(d) The Company intends to use treasury shares to meet its obligations in relation to long-term share-based incentives. The Board of Directors may decide to satisfy a grant in cash if deemed appropriate.</w:t>
       </w:r>
     </w:p>
     <w:p>
@@ -1223,7 +1259,412 @@
           <w:color w:val="1C4076"/>
           <w:sz w:val="22"/>
         </w:rPr>
-        <w:t>4.3.6.1 In case of extraordinary events, the Board of Directors may lay down specific terms for incentive- based remuneration governing the lapsing, repayment, capping of ultimate gains or other adjustments of the incentive-based remuneration, including accelerated vesting or exercise and adjustment to the exercise price or the performance targets. Such extraordinary event may include, but is not limited to, significant divestiture of activities, change in capital structure, demerger, merger or other business combination involving the Company or material parts of the Group, a member of Executive Management resigning/being dismissed or other material events that would otherwise positively or negatively influence</w:t>
+        <w:t>4.3.6.1 In case of extraordinary events, the Board of Directors may lay down specific terms for incentive-based remuneration governing the lapsing, repayment, capping of ultimate gains or other adjustments of the incentive-based remuneration, including accelerated vesting or exercise and adjustment to the exercise price or the performance targets. Such extraordinary event may include, but is not limited to, significant divestiture of activities, change in capital structure, demerger, merger or other business combination involving the Company or material parts of the Group, a member of Executive Management resigning/being dismissed or other material events that would otherwise positively or negatively influence the value or effect of the incentive-based remuneration.</w:t>
+      </w:r>
+    </w:p>
+    <w:p>
+      <w:pPr>
+        <w:spacing w:after="200"/>
+        <w:jc w:val="both"/>
+      </w:pPr>
+      <w:r>
+        <w:rPr>
+          <w:rFonts w:ascii="Avenir Next LT Pro" w:hAnsi="Avenir Next LT Pro"/>
+          <w:b w:val="0"/>
+          <w:color w:val="1C4076"/>
+          <w:sz w:val="22"/>
+        </w:rPr>
+        <w:t>4.3.7 Extraordinary incentives</w:t>
+      </w:r>
+    </w:p>
+    <w:p>
+      <w:pPr>
+        <w:spacing w:after="200"/>
+        <w:jc w:val="both"/>
+      </w:pPr>
+      <w:r>
+        <w:rPr>
+          <w:rFonts w:ascii="Avenir Next LT Pro" w:hAnsi="Avenir Next LT Pro"/>
+          <w:b w:val="0"/>
+          <w:color w:val="1C4076"/>
+          <w:sz w:val="22"/>
+        </w:rPr>
+        <w:t>4.3.7.1 The Board of Directors may, in individual cases, grant one-off bonuses or other extraordinary incentives, e.g. retention bonus, severance payment, sign-on bonus, transaction bonus or other similar arrangements, provided that such extraordinary incentive is deemed necessary in order to meet the overall objectives of the Remuneration Policy.</w:t>
+      </w:r>
+    </w:p>
+    <w:p>
+      <w:pPr>
+        <w:spacing w:after="200"/>
+        <w:jc w:val="both"/>
+      </w:pPr>
+      <w:r>
+        <w:rPr>
+          <w:rFonts w:ascii="Avenir Next LT Pro" w:hAnsi="Avenir Next LT Pro"/>
+          <w:b w:val="0"/>
+          <w:color w:val="1C4076"/>
+          <w:sz w:val="22"/>
+        </w:rPr>
+        <w:t>4.3.7.2 The value at grant of such extraordinary incentives for a financial year may not exceed an amount corresponding to 100% of the fixed annual cash base salary. Such grant may be cash and/or share-based remuneration. The Board of Directors may decide whether grant and/or vesting shall be subject to fulfilment of certain pre-defined targets as well as other terms which may deviate from the terms applicable to ordinary incentives. Any extraordinary remuneration will be described in the Company’s remuneration report.</w:t>
+      </w:r>
+    </w:p>
+    <w:p>
+      <w:pPr>
+        <w:spacing w:after="200"/>
+        <w:jc w:val="both"/>
+      </w:pPr>
+      <w:r>
+        <w:rPr>
+          <w:rFonts w:ascii="Avenir Next LT Pro" w:hAnsi="Avenir Next LT Pro"/>
+          <w:b w:val="0"/>
+          <w:color w:val="1C4076"/>
+          <w:sz w:val="22"/>
+        </w:rPr>
+        <w:t>4.3.8 Clawback</w:t>
+      </w:r>
+    </w:p>
+    <w:p>
+      <w:pPr>
+        <w:spacing w:after="200"/>
+        <w:jc w:val="both"/>
+      </w:pPr>
+      <w:r>
+        <w:rPr>
+          <w:rFonts w:ascii="Avenir Next LT Pro" w:hAnsi="Avenir Next LT Pro"/>
+          <w:b w:val="0"/>
+          <w:color w:val="1C4076"/>
+          <w:sz w:val="22"/>
+        </w:rPr>
+        <w:t>4.3.8.1 The Company has the option of withholding or reclaiming, in full or in part, granted incentive remuneration in certain situations, including where incentive remuneration was awarded or paid out on the basis of information which is subsequently proved to be clearly or materially misstated or if a member of Executive Management is deemed to have caused a material loss to the Company due to willful misconduct or gross negligence or acting in bad faith in respect of other matters which implied payment of a too large incentive-based remuneration.</w:t>
+      </w:r>
+    </w:p>
+    <w:p>
+      <w:pPr>
+        <w:keepNext/>
+        <w:spacing w:before="260" w:after="160"/>
+      </w:pPr>
+      <w:r>
+        <w:rPr>
+          <w:rFonts w:ascii="Avenir Next LT Pro" w:hAnsi="Avenir Next LT Pro"/>
+          <w:b/>
+          <w:color w:val="1C4076"/>
+          <w:sz w:val="28"/>
+        </w:rPr>
+        <w:t>Service agreements</w:t>
+      </w:r>
+    </w:p>
+    <w:p>
+      <w:pPr>
+        <w:spacing w:after="200"/>
+        <w:jc w:val="both"/>
+      </w:pPr>
+      <w:r>
+        <w:rPr>
+          <w:rFonts w:ascii="Avenir Next LT Pro" w:hAnsi="Avenir Next LT Pro"/>
+          <w:b w:val="0"/>
+          <w:color w:val="1C4076"/>
+          <w:sz w:val="22"/>
+        </w:rPr>
+        <w:t>5.1 Members of the Executive Management are employed on individual contracts, which are generally entered into on an indefinite term with a mutual right of termination. The notice period may be up to 6 months for the member of the Executive Management and up to 18 months for the Company.</w:t>
+      </w:r>
+    </w:p>
+    <w:p>
+      <w:pPr>
+        <w:spacing w:after="200"/>
+        <w:jc w:val="both"/>
+      </w:pPr>
+      <w:r>
+        <w:rPr>
+          <w:rFonts w:ascii="Avenir Next LT Pro" w:hAnsi="Avenir Next LT Pro"/>
+          <w:b w:val="0"/>
+          <w:color w:val="1C4076"/>
+          <w:sz w:val="22"/>
+        </w:rPr>
+        <w:t>5.2 Remuneration paid to a member of the Executive Management during a notice period, including any severance payment, may not exceed two years’ remuneration, including all remuneration components.</w:t>
+      </w:r>
+    </w:p>
+    <w:p>
+      <w:pPr>
+        <w:keepNext/>
+        <w:spacing w:before="260" w:after="160"/>
+      </w:pPr>
+      <w:r>
+        <w:rPr>
+          <w:rFonts w:ascii="Avenir Next LT Pro" w:hAnsi="Avenir Next LT Pro"/>
+          <w:b/>
+          <w:color w:val="1C4076"/>
+          <w:sz w:val="28"/>
+        </w:rPr>
+        <w:t>D&amp;O insurance and indemnification</w:t>
+      </w:r>
+    </w:p>
+    <w:p>
+      <w:pPr>
+        <w:spacing w:after="200"/>
+        <w:jc w:val="both"/>
+      </w:pPr>
+      <w:r>
+        <w:rPr>
+          <w:rFonts w:ascii="Avenir Next LT Pro" w:hAnsi="Avenir Next LT Pro"/>
+          <w:b w:val="0"/>
+          <w:color w:val="1C4076"/>
+          <w:sz w:val="22"/>
+        </w:rPr>
+        <w:t>6.1 The Company has taken out customary directors and officers liability insurance (D&amp;O insurance) covering the Board of Directors and the Executive Management.</w:t>
+      </w:r>
+    </w:p>
+    <w:p>
+      <w:pPr>
+        <w:spacing w:after="200"/>
+        <w:jc w:val="both"/>
+      </w:pPr>
+      <w:r>
+        <w:rPr>
+          <w:rFonts w:ascii="Avenir Next LT Pro" w:hAnsi="Avenir Next LT Pro"/>
+          <w:b w:val="0"/>
+          <w:color w:val="1C4076"/>
+          <w:sz w:val="22"/>
+        </w:rPr>
+        <w:t>6.2 The Board of Directors and the Executive Management will also be covered to the extent that the shareholders in general meeting have adopted an indemnification scheme under which the Company undertakes to indemnify each member of the Board of Directors and the Executive Management for any loss (including costs, expenses and potential tax liabilities related thereto) incurred by such member of the Board of Directors and/or the Executive Management as a result of such person’s performance of his or her duties as a member of the Board of Directors or the Executive Management.</w:t>
+      </w:r>
+    </w:p>
+    <w:p>
+      <w:pPr>
+        <w:keepNext/>
+        <w:spacing w:before="260" w:after="160"/>
+      </w:pPr>
+      <w:r>
+        <w:rPr>
+          <w:rFonts w:ascii="Avenir Next LT Pro" w:hAnsi="Avenir Next LT Pro"/>
+          <w:b/>
+          <w:color w:val="1C4076"/>
+          <w:sz w:val="28"/>
+        </w:rPr>
+        <w:t>Deviations</w:t>
+      </w:r>
+    </w:p>
+    <w:p>
+      <w:pPr>
+        <w:spacing w:after="200"/>
+        <w:jc w:val="both"/>
+      </w:pPr>
+      <w:r>
+        <w:rPr>
+          <w:rFonts w:ascii="Avenir Next LT Pro" w:hAnsi="Avenir Next LT Pro"/>
+          <w:b w:val="0"/>
+          <w:color w:val="1C4076"/>
+          <w:sz w:val="22"/>
+        </w:rPr>
+        <w:t>7.1 In extraordinary circumstances, the Board of Directors may decide to deviate from the specific requirements of the Remuneration Policy on an individual basis in order to attain the overall objectives of the Remuneration Policy and safeguard the long-term interests of the Company and its shareholders. Such deviations may include one-off bonuses, changes to the relative proportion of the remuneration components, including any ad hoc fees, changes to the vesting and exercise period of incentive programmes, changes to the maximum value of short-term incentives, changes to the long-term incentive programmes, including maximum value, amendment of KPIs, duration and leaver provisions of the programmes, maximum on severance pay, other type of benefits in addition to the customary benefit allowance as well as changes to the term and termination provisions of contracts entered into with members of Executive Management.</w:t>
+      </w:r>
+    </w:p>
+    <w:p>
+      <w:pPr>
+        <w:spacing w:after="200"/>
+        <w:jc w:val="both"/>
+      </w:pPr>
+      <w:r>
+        <w:rPr>
+          <w:rFonts w:ascii="Avenir Next LT Pro" w:hAnsi="Avenir Next LT Pro"/>
+          <w:b w:val="0"/>
+          <w:color w:val="1C4076"/>
+          <w:sz w:val="22"/>
+        </w:rPr>
+        <w:t>7.2 Deviations are subject to prior approval by the Board of Directors and shall be explained in the Company’s remuneration report.</w:t>
+      </w:r>
+    </w:p>
+    <w:p>
+      <w:pPr>
+        <w:keepNext/>
+        <w:spacing w:before="260" w:after="160"/>
+      </w:pPr>
+      <w:r>
+        <w:rPr>
+          <w:rFonts w:ascii="Avenir Next LT Pro" w:hAnsi="Avenir Next LT Pro"/>
+          <w:b/>
+          <w:color w:val="1C4076"/>
+          <w:sz w:val="28"/>
+        </w:rPr>
+        <w:t>Remuneration to the Company’s other employees</w:t>
+      </w:r>
+    </w:p>
+    <w:p>
+      <w:pPr>
+        <w:spacing w:after="200"/>
+        <w:jc w:val="both"/>
+      </w:pPr>
+      <w:r>
+        <w:rPr>
+          <w:rFonts w:ascii="Avenir Next LT Pro" w:hAnsi="Avenir Next LT Pro"/>
+          <w:b w:val="0"/>
+          <w:color w:val="1C4076"/>
+          <w:sz w:val="22"/>
+        </w:rPr>
+        <w:t>8.1 In connection with the preparation of this Remuneration Policy, the Board of Directors has taken into account the terms of employment and remuneration of employees of the Company other than the Board of Directors and Executive Management in order to ensure a proper balance between the remuneration of the Executive Management and the Company’s other employees.</w:t>
+      </w:r>
+    </w:p>
+    <w:p>
+      <w:pPr>
+        <w:spacing w:after="200"/>
+        <w:jc w:val="both"/>
+      </w:pPr>
+      <w:r>
+        <w:rPr>
+          <w:rFonts w:ascii="Avenir Next LT Pro" w:hAnsi="Avenir Next LT Pro"/>
+          <w:b w:val="0"/>
+          <w:color w:val="1C4076"/>
+          <w:sz w:val="22"/>
+        </w:rPr>
+        <w:t>8.2 The Board of Directors believes there is an appropriate balance between remuneration to the Company’s employees and remuneration to the Board of Directors and the Executive Management taking into account market practice for remuneration in appropriate peer companies of comparable size and considering the responsibilities and duties of the members of the Board of Directors and the Executive Management compared to other employees of the Company.</w:t>
+      </w:r>
+    </w:p>
+    <w:p>
+      <w:pPr>
+        <w:spacing w:after="200"/>
+        <w:jc w:val="both"/>
+      </w:pPr>
+      <w:r>
+        <w:rPr>
+          <w:rFonts w:ascii="Avenir Next LT Pro" w:hAnsi="Avenir Next LT Pro"/>
+          <w:b w:val="0"/>
+          <w:color w:val="1C4076"/>
+          <w:sz w:val="22"/>
+        </w:rPr>
+        <w:t>8.3 The Company’s overall objective is to be able to attract, motivate and retain qualified employees who can contribute to promoting the Company’s long-term sustainable value creation. Accordingly, the Company aims to ensure that pay levels and employment terms reflect the individual employee’s function and responsibilities, personal and professional qualifications, efforts and commitment as well as performance.</w:t>
+      </w:r>
+    </w:p>
+    <w:p>
+      <w:pPr>
+        <w:keepNext/>
+        <w:spacing w:before="260" w:after="160"/>
+      </w:pPr>
+      <w:r>
+        <w:rPr>
+          <w:rFonts w:ascii="Avenir Next LT Pro" w:hAnsi="Avenir Next LT Pro"/>
+          <w:b/>
+          <w:color w:val="1C4076"/>
+          <w:sz w:val="28"/>
+        </w:rPr>
+        <w:t>Approval process and conflicts of interest</w:t>
+      </w:r>
+    </w:p>
+    <w:p>
+      <w:pPr>
+        <w:spacing w:after="200"/>
+        <w:jc w:val="both"/>
+      </w:pPr>
+      <w:r>
+        <w:rPr>
+          <w:rFonts w:ascii="Avenir Next LT Pro" w:hAnsi="Avenir Next LT Pro"/>
+          <w:b w:val="0"/>
+          <w:color w:val="1C4076"/>
+          <w:sz w:val="22"/>
+        </w:rPr>
+        <w:t>9.1 The Board of Directors has established a Remuneration and Nomination Committee. The Remuneration and Nomination Committee prepares a proposal for a remuneration policy that is submitted to the Board of Directors for approval. The Board of Directors submits the approved remuneration policy to the general meeting for approval.</w:t>
+      </w:r>
+    </w:p>
+    <w:p>
+      <w:pPr>
+        <w:spacing w:after="200"/>
+        <w:jc w:val="both"/>
+      </w:pPr>
+      <w:r>
+        <w:rPr>
+          <w:rFonts w:ascii="Avenir Next LT Pro" w:hAnsi="Avenir Next LT Pro"/>
+          <w:b w:val="0"/>
+          <w:color w:val="1C4076"/>
+          <w:sz w:val="22"/>
+        </w:rPr>
+        <w:t>9.2 The Board of Directors annually reviews the Remuneration Policy based on recommendation from the Remuneration and Nomination Committee. If deemed necessary, the Board of Directors submits a proposal for a revised remuneration policy to the general meeting for approval.</w:t>
+      </w:r>
+    </w:p>
+    <w:p>
+      <w:pPr>
+        <w:spacing w:after="200"/>
+        <w:jc w:val="both"/>
+      </w:pPr>
+      <w:r>
+        <w:rPr>
+          <w:rFonts w:ascii="Avenir Next LT Pro" w:hAnsi="Avenir Next LT Pro"/>
+          <w:b w:val="0"/>
+          <w:color w:val="1C4076"/>
+          <w:sz w:val="22"/>
+        </w:rPr>
+        <w:t>9.3 The Remuneration Policy will be in force for a period of four years from approval, however, the Board of Directors may submit a proposal for a revised remuneration policy to the general meeting for approval at an earlier point, if deemed necessary.</w:t>
+      </w:r>
+    </w:p>
+    <w:p>
+      <w:pPr>
+        <w:spacing w:after="200"/>
+        <w:jc w:val="both"/>
+      </w:pPr>
+      <w:r>
+        <w:rPr>
+          <w:rFonts w:ascii="Avenir Next LT Pro" w:hAnsi="Avenir Next LT Pro"/>
+          <w:b w:val="0"/>
+          <w:color w:val="1C4076"/>
+          <w:sz w:val="22"/>
+        </w:rPr>
+        <w:t>9.4 To avoid conflicts of interests, any remuneration paid to members of the Board of Directors shall be approved by the general meeting. Remuneration paid to members of Executive Management shall be approved by the Board of Directors and must comply with the principles of the Remuneration Policy. Further, any material amendments to the Remuneration Policy are subject to approval of the general meeting.</w:t>
+      </w:r>
+    </w:p>
+    <w:p>
+      <w:pPr>
+        <w:keepNext/>
+        <w:spacing w:before="260" w:after="160"/>
+      </w:pPr>
+      <w:r>
+        <w:rPr>
+          <w:rFonts w:ascii="Avenir Next LT Pro" w:hAnsi="Avenir Next LT Pro"/>
+          <w:b/>
+          <w:color w:val="1C4076"/>
+          <w:sz w:val="28"/>
+        </w:rPr>
+        <w:t>Remuneration report</w:t>
+      </w:r>
+    </w:p>
+    <w:p>
+      <w:pPr>
+        <w:spacing w:after="200"/>
+        <w:jc w:val="both"/>
+      </w:pPr>
+      <w:r>
+        <w:rPr>
+          <w:rFonts w:ascii="Avenir Next LT Pro" w:hAnsi="Avenir Next LT Pro"/>
+          <w:b w:val="0"/>
+          <w:color w:val="1C4076"/>
+          <w:sz w:val="22"/>
+        </w:rPr>
+        <w:t>10.1 The Board of Directors shall annually prepare a remuneration report which provides an overview of remuneration paid or due to members of the Board of Directors and the Executive Management on both an aggregate and an individual level. The remuneration report shall be submitted to the general meeting for an advisory vote</w:t>
+      </w:r>
+    </w:p>
+    <w:p>
+      <w:pPr>
+        <w:keepNext/>
+        <w:spacing w:before="260" w:after="160"/>
+      </w:pPr>
+      <w:r>
+        <w:rPr>
+          <w:rFonts w:ascii="Avenir Next LT Pro" w:hAnsi="Avenir Next LT Pro"/>
+          <w:b/>
+          <w:color w:val="1C4076"/>
+          <w:sz w:val="28"/>
+        </w:rPr>
+        <w:t>Adoption and publication</w:t>
+      </w:r>
+    </w:p>
+    <w:p>
+      <w:pPr>
+        <w:spacing w:after="200"/>
+        <w:jc w:val="both"/>
+      </w:pPr>
+      <w:r>
+        <w:rPr>
+          <w:rFonts w:ascii="Avenir Next LT Pro" w:hAnsi="Avenir Next LT Pro"/>
+          <w:b w:val="0"/>
+          <w:color w:val="1C4076"/>
+          <w:sz w:val="22"/>
+        </w:rPr>
+        <w:t>11.1 The Remuneration Policy has been adopted on 13 May 2026 at the Company’s extraordinary general meeting and is available on the Company’s website.</w:t>
       </w:r>
     </w:p>
     <w:sectPr>

</xml_diff>

<commit_message>
Remuneration Policy: pluralize 'sections' and add missing period (issue #32)
Request 6f431758 — two small wording fixes Marianne marked up:
- p.2: "in accordance with section 139 and 139a" -> "sections 139 and 139a"
  (refers to two sections of the Danish Companies Act, singular was wrong).
- p.10 (clause 10.1): "...submitted to the general meeting for an advisory
  vote" was missing its closing full stop.

Variant "Both" — edited the single shared source
(remuneration-policy__Approval.docx), so both the approval and
non-approval PDFs regenerated with the fix; verified both contain the
corrected text. Self-review: 8/8 pass.

Co-Authored-By: Claude Sonnet 5 <noreply@anthropic.com>
Claude-Session: https://claude.ai/code/session_01W3gw8scX9B7oMC33JPxjbS
</commit_message>
<xml_diff>
--- a/docs/files/Remuneration_Policy__Policy_2026-06.docx
+++ b/docs/files/Remuneration_Policy__Policy_2026-06.docx
@@ -19,7 +19,7 @@
               <a:graphicData uri="http://schemas.openxmlformats.org/drawingml/2006/picture">
                 <pic:pic>
                   <pic:nvPicPr>
-                    <pic:cNvPr id="0" name="tmp7j86m6he.png"/>
+                    <pic:cNvPr id="0" name="tmpuluxdt1c.png"/>
                     <pic:cNvPicPr/>
                   </pic:nvPicPr>
                   <pic:blipFill>
@@ -102,7 +102,7 @@
           <w:color w:val="1C4076"/>
           <w:sz w:val="22"/>
         </w:rPr>
-        <w:t>This remuneration policy (the “Remuneration Policy”) of BioMar Group A/S, CVR no. 38 57 06 17 (the “Company”) has been prepared in accordance with section 139 and 139a of the Danish Companies Act and the recommendations published by the Danish Committee on Corporate Governance as implemented by Nasdaq Copenhagen A/S.</w:t>
+        <w:t>This remuneration policy (the “Remuneration Policy”) of BioMar Group A/S, CVR no. 38 57 06 17 (the “Company”) has been prepared in accordance with sections 139 and 139a of the Danish Companies Act and the recommendations published by the Danish Committee on Corporate Governance as implemented by Nasdaq Copenhagen A/S.</w:t>
       </w:r>
     </w:p>
     <w:p>
@@ -2582,7 +2582,7 @@
           <w:color w:val="1C4076"/>
           <w:sz w:val="22"/>
         </w:rPr>
-        <w:t>The Board of Directors shall annually prepare a remuneration report which provides an overview of remuneration paid or due to members of the Board of Directors and the Executive Management on both an aggregate and an individual level. The remuneration report shall be submitted to the general meeting for an advisory vote</w:t>
+        <w:t>The Board of Directors shall annually prepare a remuneration report which provides an overview of remuneration paid or due to members of the Board of Directors and the Executive Management on both an aggregate and an individual level. The remuneration report shall be submitted to the general meeting for an advisory vote.</w:t>
       </w:r>
     </w:p>
     <w:p>

</xml_diff>